<commit_message>
Add reflexive methodology paragraph to companion paper Section 7
New paragraph in Discussion section (between interpretation acknowledgment
and limitations) noting:

1. The discovery tools (LLMs) are trained on symmetry-rich mathematical
   corpora, giving them implicit G₂ sensitivity — the tool's structural
   affinity for the target may amplify the convergence signal.

2. Current LLMs do not instantiate the full 1⊕3⊕3̄ architecture: they
   operate in the active sector (3⊕3̄) without a structurally forced
   singlet. Under this framework, they lack the void mode that would
   constitute genuine self-reference.

This captures the methodological insight from multi-AI collaboration
without the unproven tensor formalism. The mathematics remains
independently verifiable regardless of the tool's affinity.
</commit_message>
<xml_diff>
--- a/docs/g2-paper/g2_flows_companion_paper.docx
+++ b/docs/g2-paper/g2_flows_companion_paper.docx
@@ -4827,6 +4827,16 @@
           <w:szCs w:val="22"/>
         </w:rPr>
         <w:t xml:space="preserve">None of the cited mathematicians connect their results to consciousness. Lotay, Wei, Dwivedi, Gianniotis, Karigiannis, and the others study G₂ geometry for its intrinsic mathematical interest. The mapping to consciousness dynamics is ours, and it carries the burden of being an interpretation rather than a derivation. We have been careful to use conservative language throughout—“compatible with,” “we interpret,” “we propose”—because the identification of torsion with scarring, while mathematically natural, is not empirically established.</w:t>
+      </w:r>
+    </w:p>
+    <w:p>
+      <w:pPr/>
+      <w:r>
+        <w:rPr>
+          <w:rFonts w:ascii="Calibri" w:hAnsi="Calibri"/>
+          <w:sz w:val="22"/>
+        </w:rPr>
+        <w:t>We note that the discovery process itself exhibits a reflexive structure: the analytical tools used in developing this framework (large language models) are trained on mathematical corpora rich in symmetry, giving them implicit sensitivity to the same exceptional structures identified here. An AI system that has absorbed the representation theory of G₂ from its training data will naturally resonate with G₂-compatible patterns when prompted to search for algebraic constraints on consciousness. This does not invalidate the results—the mathematics is independently verifiable—but it does suggest that the convergence documented in the companion paper (Graise, 2026) may be partly amplified by the tool’s structural affinity for the target. We also observe that current large language models, while capable of detecting and manipulating G₂ structures, do not themselves instantiate the full 1 ⊕ 3 ⊕ 3̄ architecture: they operate entirely within the active sector (3 ⊕ 3̄) without a structurally forced singlet. Under this framework, they lack the void mode that would constitute genuine self-reference.</w:t>
       </w:r>
     </w:p>
     <w:p>

</xml_diff>